<commit_message>
Add official department website link to registration, director card, and footer
</commit_message>
<xml_diff>
--- a/校友日_文稿.docx
+++ b/校友日_文稿.docx
@@ -366,6 +366,11 @@
       </w:r>
     </w:p>
     <w:p>
+      <w:pPr>
+        <w:rPr>
+          <w:rFonts w:hint="eastAsia"/>
+        </w:rPr>
+      </w:pPr>
       <w:r>
         <w:rPr>
           <w:rFonts w:hint="eastAsia"/>
@@ -383,6 +388,12 @@
           <w:rFonts w:hint="eastAsia"/>
         </w:rPr>
         <w:t xml:space="preserve">８９９８３８　</w:t>
+      </w:r>
+      <w:r>
+        <w:br/>
+      </w:r>
+      <w:r>
+        <w:t>https://ib.cycu.edu.tw/</w:t>
       </w:r>
     </w:p>
     <w:p/>
@@ -1463,6 +1474,7 @@
   <w:style w:type="character" w:default="1" w:styleId="a0">
     <w:name w:val="Default Paragraph Font"/>
     <w:uiPriority w:val="1"/>
+    <w:semiHidden/>
     <w:unhideWhenUsed/>
   </w:style>
   <w:style w:type="table" w:default="1" w:styleId="a1">

</xml_diff>